<commit_message>
Add 1–2 threshold alerts per mall to Parque Arauco fichas
Each recinto ficha now proposes the one or two most important WES
threshold alerts for the meeting. Daily = operational average × 1.25;
night = m³ 00:00–06:00. No night threshold on points that already have
control. A closing slide lists all seven malls for the room.

Co-authored-by: anibaloperacionesWes <anibaloperacionesWes@users.noreply.github.com>
</commit_message>
<xml_diff>
--- a/reports/Parque_Arauco/TMP_7MALLS/entrega_diego_anibal/Fichas_ejecutivas_Parque_Arauco_20260816.docx
+++ b/reports/Parque_Arauco/TMP_7MALLS/entrega_diego_anibal/Fichas_ejecutivas_Parque_Arauco_20260816.docx
@@ -30,7 +30,7 @@
           <w:rFonts w:ascii="Calibri" w:hAnsi="Calibri"/>
           <w:sz w:val="22"/>
         </w:rPr>
-        <w:t>Período 01/06/2026 – 16/08/2026. Emisión 17 agosto 2026. Cinco variables por mall: equipos instalados, consumo mensualizado de los puntos WES, hallazgos, solicitudes, y noche con control (no se lee como fuga). Alineado al PPT 7 Malls de la carpeta entrega_diego_anibal, con datos junio–agosto.</w:t>
+        <w:t>Período 01/06/2026 – 16/08/2026. Emisión 17 agosto 2026. Seis variables por mall: equipos instalados, consumo mensualizado de los puntos WES, hallazgos, solicitudes, noche con control (no se lee como fuga) y alertas de umbral a proponer en la reunión (1 o 2 por mall). Alineado al PPT 7 Malls de la carpeta entrega_diego_anibal, con datos junio–agosto.</w:t>
       </w:r>
     </w:p>
     <w:p>
@@ -727,6 +727,44 @@
     </w:p>
     <w:p>
       <w:r>
+        <w:rPr>
+          <w:b/>
+          <w:color w:val="1F77B4"/>
+          <w:sz w:val="26"/>
+        </w:rPr>
+        <w:t>6. Alertas de umbral — proponer en la reunión</w:t>
+      </w:r>
+    </w:p>
+    <w:p>
+      <w:pPr>
+        <w:pStyle w:val="ListBullet"/>
+        <w:spacing w:after="80" w:before="0"/>
+      </w:pPr>
+      <w:r>
+        <w:rPr>
+          <w:rFonts w:ascii="Calibri" w:hAnsi="Calibri"/>
+          <w:color w:val="0D3B66"/>
+          <w:sz w:val="22"/>
+        </w:rPr>
+        <w:t>Estanque Norte (000025-01): umbral diario 40 m³/día. Base jun–jul ~25; agosto ~52 y el 16/08 = 93. Marca el alza diurna de locales (la noche ya tiene control).</w:t>
+      </w:r>
+    </w:p>
+    <w:p>
+      <w:pPr>
+        <w:pStyle w:val="ListBullet"/>
+        <w:spacing w:after="80" w:before="0"/>
+      </w:pPr>
+      <w:r>
+        <w:rPr>
+          <w:rFonts w:ascii="Calibri" w:hAnsi="Calibri"/>
+          <w:color w:val="0D3B66"/>
+          <w:sz w:val="22"/>
+        </w:rPr>
+        <w:t>Pizza Hut (000025-07): umbral diario 25 m³/día. Agosto ~14 m³/día; julio se disparó (hasta 195). Avisa si vuelve el alza diurna. Sin umbral de madrugada: control 00:00–06:00 activo.</w:t>
+      </w:r>
+    </w:p>
+    <w:p>
+      <w:r>
         <w:br w:type="page"/>
       </w:r>
     </w:p>
@@ -1389,6 +1427,44 @@
     </w:p>
     <w:p>
       <w:r>
+        <w:rPr>
+          <w:b/>
+          <w:color w:val="1F77B4"/>
+          <w:sz w:val="26"/>
+        </w:rPr>
+        <w:t>6. Alertas de umbral — proponer en la reunión</w:t>
+      </w:r>
+    </w:p>
+    <w:p>
+      <w:pPr>
+        <w:pStyle w:val="ListBullet"/>
+        <w:spacing w:after="80" w:before="0"/>
+      </w:pPr>
+      <w:r>
+        <w:rPr>
+          <w:rFonts w:ascii="Calibri" w:hAnsi="Calibri"/>
+          <w:color w:val="0D3B66"/>
+          <w:sz w:val="22"/>
+        </w:rPr>
+        <w:t>Placa Bancaria (000025-08): umbral diario 155 m³/día (agosto ~123 × 1,25). El 18/06 llegó a ~410; WES avisa si se repite el salto, sin usar la media inflada de junio.</w:t>
+      </w:r>
+    </w:p>
+    <w:p>
+      <w:pPr>
+        <w:pStyle w:val="ListBullet"/>
+        <w:spacing w:after="80" w:before="0"/>
+      </w:pPr>
+      <w:r>
+        <w:rPr>
+          <w:rFonts w:ascii="Calibri" w:hAnsi="Calibri"/>
+          <w:color w:val="0D3B66"/>
+          <w:sz w:val="22"/>
+        </w:rPr>
+        <w:t>Ripley (000025-10): umbral diario 125 m³/día (promedio ~99 × 1,25). Segundo volumen del recinto; noches ya ~0. Falabella: aún sin umbral fijo (2–3 semanas de baseline).</w:t>
+      </w:r>
+    </w:p>
+    <w:p>
+      <w:r>
         <w:br w:type="page"/>
       </w:r>
     </w:p>
@@ -1981,6 +2057,44 @@
     </w:p>
     <w:p>
       <w:r>
+        <w:rPr>
+          <w:b/>
+          <w:color w:val="1F77B4"/>
+          <w:sz w:val="26"/>
+        </w:rPr>
+        <w:t>6. Alertas de umbral — proponer en la reunión</w:t>
+      </w:r>
+    </w:p>
+    <w:p>
+      <w:pPr>
+        <w:pStyle w:val="ListBullet"/>
+        <w:spacing w:after="80" w:before="0"/>
+      </w:pPr>
+      <w:r>
+        <w:rPr>
+          <w:rFonts w:ascii="Calibri" w:hAnsi="Calibri"/>
+          <w:color w:val="0D3B66"/>
+          <w:sz w:val="22"/>
+        </w:rPr>
+        <w:t>Matriz Principal (000025-13) — nocturno: alerta si 00:00–06:00 &gt; 8 m³ (hoy 21–26 m³). Es lo que hay que ver en sala hasta que exista on/off.</w:t>
+      </w:r>
+    </w:p>
+    <w:p>
+      <w:pPr>
+        <w:pStyle w:val="ListBullet"/>
+        <w:spacing w:after="80" w:before="0"/>
+      </w:pPr>
+      <w:r>
+        <w:rPr>
+          <w:rFonts w:ascii="Calibri" w:hAnsi="Calibri"/>
+          <w:color w:val="0D3B66"/>
+          <w:sz w:val="22"/>
+        </w:rPr>
+        <w:t>Matriz Principal — diario: umbral 230 m³/día (mediana ~187 × 1,25). Agosto ~202; avisa si el alza jun→ago sigue. Baños: no priorizar.</w:t>
+      </w:r>
+    </w:p>
+    <w:p>
+      <w:r>
         <w:br w:type="page"/>
       </w:r>
     </w:p>
@@ -2559,6 +2673,44 @@
     </w:p>
     <w:p>
       <w:r>
+        <w:rPr>
+          <w:b/>
+          <w:color w:val="1F77B4"/>
+          <w:sz w:val="26"/>
+        </w:rPr>
+        <w:t>6. Alertas de umbral — proponer en la reunión</w:t>
+      </w:r>
+    </w:p>
+    <w:p>
+      <w:pPr>
+        <w:pStyle w:val="ListBullet"/>
+        <w:spacing w:after="80" w:before="0"/>
+      </w:pPr>
+      <w:r>
+        <w:rPr>
+          <w:rFonts w:ascii="Calibri" w:hAnsi="Calibri"/>
+          <w:color w:val="0D3B66"/>
+          <w:sz w:val="22"/>
+        </w:rPr>
+        <w:t>San Ignacio 500 (000025-18) — diario: umbral 145 m³/día (agosto ~116 × 1,25). La noche ya está controlada; el umbral vigila el caudal diurno que no volvió a junio.</w:t>
+      </w:r>
+    </w:p>
+    <w:p>
+      <w:pPr>
+        <w:pStyle w:val="ListBullet"/>
+        <w:spacing w:after="80" w:before="0"/>
+      </w:pPr>
+      <w:r>
+        <w:rPr>
+          <w:rFonts w:ascii="Calibri" w:hAnsi="Calibri"/>
+          <w:color w:val="0D3B66"/>
+          <w:sz w:val="22"/>
+        </w:rPr>
+        <w:t>San Ignacio 300 (000025-17) — nocturno: alerta si 00:00–06:00 &gt; 4 m³ (el 10/08 fueron ~10 m³, ~51% del día). Sin control: esta es la alerta de madrugada del recinto.</w:t>
+      </w:r>
+    </w:p>
+    <w:p>
+      <w:r>
         <w:br w:type="page"/>
       </w:r>
     </w:p>
@@ -3151,6 +3303,44 @@
     </w:p>
     <w:p>
       <w:r>
+        <w:rPr>
+          <w:b/>
+          <w:color w:val="1F77B4"/>
+          <w:sz w:val="26"/>
+        </w:rPr>
+        <w:t>6. Alertas de umbral — proponer en la reunión</w:t>
+      </w:r>
+    </w:p>
+    <w:p>
+      <w:pPr>
+        <w:pStyle w:val="ListBullet"/>
+        <w:spacing w:after="80" w:before="0"/>
+      </w:pPr>
+      <w:r>
+        <w:rPr>
+          <w:rFonts w:ascii="Calibri" w:hAnsi="Calibri"/>
+          <w:color w:val="0D3B66"/>
+          <w:sz w:val="22"/>
+        </w:rPr>
+        <w:t>Matriz 1° piso (000025-11) — nocturno: alerta si 00:00–06:00 &gt; 3 m³ (el 10/08 = 6,5 m³). De día está estable (~56 m³); la madrugada es lo que hay que gestionar.</w:t>
+      </w:r>
+    </w:p>
+    <w:p>
+      <w:pPr>
+        <w:pStyle w:val="ListBullet"/>
+        <w:spacing w:after="80" w:before="0"/>
+      </w:pPr>
+      <w:r>
+        <w:rPr>
+          <w:rFonts w:ascii="Calibri" w:hAnsi="Calibri"/>
+          <w:color w:val="0D3B66"/>
+          <w:sz w:val="22"/>
+        </w:rPr>
+        <w:t>Anillo Plaza (000025-12): umbral diario 22 m³/día (promedio ~17 × 1,25). Julio tuvo un pico de 58; agosto bajó a ~13. Avisa si se reabre esa alza.</w:t>
+      </w:r>
+    </w:p>
+    <w:p>
+      <w:r>
         <w:br w:type="page"/>
       </w:r>
     </w:p>
@@ -3729,6 +3919,44 @@
     </w:p>
     <w:p>
       <w:r>
+        <w:rPr>
+          <w:b/>
+          <w:color w:val="1F77B4"/>
+          <w:sz w:val="26"/>
+        </w:rPr>
+        <w:t>6. Alertas de umbral — proponer en la reunión</w:t>
+      </w:r>
+    </w:p>
+    <w:p>
+      <w:pPr>
+        <w:pStyle w:val="ListBullet"/>
+        <w:spacing w:after="80" w:before="0"/>
+      </w:pPr>
+      <w:r>
+        <w:rPr>
+          <w:rFonts w:ascii="Calibri" w:hAnsi="Calibri"/>
+          <w:color w:val="0D3B66"/>
+          <w:sz w:val="22"/>
+        </w:rPr>
+        <w:t>Anillo Sur (000025-37): umbral diario 14 m³/día (promedio ~11 × 1,25). Recinto estable; es el anillo de mayor volumen.</w:t>
+      </w:r>
+    </w:p>
+    <w:p>
+      <w:pPr>
+        <w:pStyle w:val="ListBullet"/>
+        <w:spacing w:after="80" w:before="0"/>
+      </w:pPr>
+      <w:r>
+        <w:rPr>
+          <w:rFonts w:ascii="Calibri" w:hAnsi="Calibri"/>
+          <w:color w:val="0D3B66"/>
+          <w:sz w:val="22"/>
+        </w:rPr>
+        <w:t>Anillo Norte (000025-38): umbral diario 13 m³/día (promedio ~10 × 1,25). Los dos anillos cubren el mall; no hay un tercer punto que priorizar.</w:t>
+      </w:r>
+    </w:p>
+    <w:p>
+      <w:r>
         <w:br w:type="page"/>
       </w:r>
     </w:p>
@@ -4443,6 +4671,44 @@
           <w:sz w:val="22"/>
         </w:rPr>
         <w:t>El patrón 0–8 h del DL SÍ entra al análisis: es el hallazgo a gestionar.</w:t>
+      </w:r>
+    </w:p>
+    <w:p>
+      <w:r>
+        <w:rPr>
+          <w:b/>
+          <w:color w:val="1F77B4"/>
+          <w:sz w:val="26"/>
+        </w:rPr>
+        <w:t>6. Alertas de umbral — proponer en la reunión</w:t>
+      </w:r>
+    </w:p>
+    <w:p>
+      <w:pPr>
+        <w:pStyle w:val="ListBullet"/>
+        <w:spacing w:after="80" w:before="0"/>
+      </w:pPr>
+      <w:r>
+        <w:rPr>
+          <w:rFonts w:ascii="Calibri" w:hAnsi="Calibri"/>
+          <w:color w:val="0D3B66"/>
+          <w:sz w:val="22"/>
+        </w:rPr>
+        <w:t>Distrito de Lujo (000025-27) — nocturno: alerta si 00:00–06:00 &gt; 15 m³ (el 10/08 = 41 m³). Es el mayor impacto de madrugada de Kennedy.</w:t>
+      </w:r>
+    </w:p>
+    <w:p>
+      <w:pPr>
+        <w:pStyle w:val="ListBullet"/>
+        <w:spacing w:after="80" w:before="0"/>
+      </w:pPr>
+      <w:r>
+        <w:rPr>
+          <w:rFonts w:ascii="Calibri" w:hAnsi="Calibri"/>
+          <w:color w:val="0D3B66"/>
+          <w:sz w:val="22"/>
+        </w:rPr>
+        <w:t>Andén Locales Gastronómicos (000025-21): umbral diario 180 m³/día (promedio ~144 × 1,25). Agosto ~219: confirma el alza. No umbral en Sandía: es bomba de la cadena DL.</w:t>
       </w:r>
     </w:p>
     <w:p>
@@ -5509,6 +5775,725 @@
         <w:t>Fuente: API de medidas WES, 01/06/2026 – 16/08/2026. La proyección de agosto es lineal (16 días → 31). Si el punto tiene control nocturno, esa madrugada no se interpreta como fuga.</w:t>
       </w:r>
     </w:p>
+    <w:p>
+      <w:r>
+        <w:rPr>
+          <w:b/>
+          <w:color w:val="0D3B66"/>
+          <w:sz w:val="32"/>
+        </w:rPr>
+        <w:t>Umbrales a cargar en WES — para la reunión</w:t>
+      </w:r>
+    </w:p>
+    <w:p>
+      <w:r>
+        <w:rPr>
+          <w:sz w:val="22"/>
+        </w:rPr>
+        <w:t>1 o 2 cortes por mall. Diario = promedio operativo × 1,25. Nocturno = m³ en 00:00–06:00. No se propone umbral de madrugada en puntos que ya tienen control (SI500, Pizza Hut, Estanque Norte, Estanque Sur).</w:t>
+      </w:r>
+    </w:p>
+    <w:tbl>
+      <w:tblPr>
+        <w:tblStyle w:val="TableGrid"/>
+        <w:tblW w:type="auto" w:w="0"/>
+        <w:tblLook w:firstColumn="1" w:firstRow="1" w:lastColumn="0" w:lastRow="0" w:noHBand="0" w:noVBand="1" w:val="04A0"/>
+      </w:tblPr>
+      <w:tblGrid>
+        <w:gridCol w:w="2550"/>
+        <w:gridCol w:w="2550"/>
+        <w:gridCol w:w="2550"/>
+        <w:gridCol w:w="2550"/>
+      </w:tblGrid>
+      <w:tr>
+        <w:tc>
+          <w:tcPr>
+            <w:tcW w:type="dxa" w:w="2550"/>
+            <w:shd w:fill="0D3B66" w:val="clear"/>
+          </w:tcPr>
+          <w:p>
+            <w:pPr>
+              <w:jc w:val="center"/>
+            </w:pPr>
+            <w:r/>
+            <w:r>
+              <w:rPr>
+                <w:rFonts w:ascii="Calibri" w:hAnsi="Calibri"/>
+                <w:b/>
+                <w:color w:val="FFFFFF"/>
+                <w:sz w:val="18"/>
+              </w:rPr>
+              <w:t>Mall</w:t>
+            </w:r>
+          </w:p>
+        </w:tc>
+        <w:tc>
+          <w:tcPr>
+            <w:tcW w:type="dxa" w:w="2550"/>
+            <w:shd w:fill="0D3B66" w:val="clear"/>
+          </w:tcPr>
+          <w:p>
+            <w:pPr>
+              <w:jc w:val="center"/>
+            </w:pPr>
+            <w:r/>
+            <w:r>
+              <w:rPr>
+                <w:rFonts w:ascii="Calibri" w:hAnsi="Calibri"/>
+                <w:b/>
+                <w:color w:val="FFFFFF"/>
+                <w:sz w:val="18"/>
+              </w:rPr>
+              <w:t>Umbral 1 (prioridad)</w:t>
+            </w:r>
+          </w:p>
+        </w:tc>
+        <w:tc>
+          <w:tcPr>
+            <w:tcW w:type="dxa" w:w="2550"/>
+            <w:shd w:fill="0D3B66" w:val="clear"/>
+          </w:tcPr>
+          <w:p>
+            <w:pPr>
+              <w:jc w:val="center"/>
+            </w:pPr>
+            <w:r/>
+            <w:r>
+              <w:rPr>
+                <w:rFonts w:ascii="Calibri" w:hAnsi="Calibri"/>
+                <w:b/>
+                <w:color w:val="FFFFFF"/>
+                <w:sz w:val="18"/>
+              </w:rPr>
+              <w:t>Umbral 2</w:t>
+            </w:r>
+          </w:p>
+        </w:tc>
+        <w:tc>
+          <w:tcPr>
+            <w:tcW w:type="dxa" w:w="2550"/>
+            <w:shd w:fill="0D3B66" w:val="clear"/>
+          </w:tcPr>
+          <w:p>
+            <w:pPr>
+              <w:jc w:val="center"/>
+            </w:pPr>
+            <w:r/>
+            <w:r>
+              <w:rPr>
+                <w:rFonts w:ascii="Calibri" w:hAnsi="Calibri"/>
+                <w:b/>
+                <w:color w:val="FFFFFF"/>
+                <w:sz w:val="18"/>
+              </w:rPr>
+              <w:t>Por qué</w:t>
+            </w:r>
+          </w:p>
+        </w:tc>
+      </w:tr>
+      <w:tr>
+        <w:tc>
+          <w:tcPr>
+            <w:tcW w:type="dxa" w:w="2550"/>
+            <w:shd w:fill="F5F7FA" w:val="clear"/>
+          </w:tcPr>
+          <w:p>
+            <w:pPr>
+              <w:jc w:val="left"/>
+            </w:pPr>
+            <w:r/>
+            <w:r>
+              <w:rPr>
+                <w:rFonts w:ascii="Calibri" w:hAnsi="Calibri"/>
+                <w:b/>
+                <w:color w:val="0D3B66"/>
+                <w:sz w:val="18"/>
+              </w:rPr>
+              <w:t>MAE Estación</w:t>
+            </w:r>
+          </w:p>
+        </w:tc>
+        <w:tc>
+          <w:tcPr>
+            <w:tcW w:type="dxa" w:w="2550"/>
+            <w:shd w:fill="F5F7FA" w:val="clear"/>
+          </w:tcPr>
+          <w:p>
+            <w:pPr>
+              <w:jc w:val="left"/>
+            </w:pPr>
+            <w:r/>
+            <w:r>
+              <w:rPr>
+                <w:rFonts w:ascii="Calibri" w:hAnsi="Calibri"/>
+                <w:b w:val="0"/>
+                <w:color w:val="0D3B66"/>
+                <w:sz w:val="18"/>
+              </w:rPr>
+              <w:t>Diario · Estanque Norte (01): 40 m³/día</w:t>
+            </w:r>
+          </w:p>
+        </w:tc>
+        <w:tc>
+          <w:tcPr>
+            <w:tcW w:type="dxa" w:w="2550"/>
+            <w:shd w:fill="F5F7FA" w:val="clear"/>
+          </w:tcPr>
+          <w:p>
+            <w:pPr>
+              <w:jc w:val="left"/>
+            </w:pPr>
+            <w:r/>
+            <w:r>
+              <w:rPr>
+                <w:rFonts w:ascii="Calibri" w:hAnsi="Calibri"/>
+                <w:b w:val="0"/>
+                <w:color w:val="0D3B66"/>
+                <w:sz w:val="18"/>
+              </w:rPr>
+              <w:t>Diario · Pizza Hut (07): 25 m³/día</w:t>
+            </w:r>
+          </w:p>
+        </w:tc>
+        <w:tc>
+          <w:tcPr>
+            <w:tcW w:type="dxa" w:w="2550"/>
+            <w:shd w:fill="F5F7FA" w:val="clear"/>
+          </w:tcPr>
+          <w:p>
+            <w:pPr>
+              <w:jc w:val="left"/>
+            </w:pPr>
+            <w:r/>
+            <w:r>
+              <w:rPr>
+                <w:rFonts w:ascii="Calibri" w:hAnsi="Calibri"/>
+                <w:b w:val="0"/>
+                <w:color w:val="0D3B66"/>
+                <w:sz w:val="18"/>
+              </w:rPr>
+              <w:t>Alza diurna ago; noche ya controlada</w:t>
+            </w:r>
+          </w:p>
+        </w:tc>
+      </w:tr>
+      <w:tr>
+        <w:tc>
+          <w:tcPr>
+            <w:tcW w:type="dxa" w:w="2550"/>
+            <w:shd w:fill="FFFFFF" w:val="clear"/>
+          </w:tcPr>
+          <w:p>
+            <w:pPr>
+              <w:jc w:val="left"/>
+            </w:pPr>
+            <w:r/>
+            <w:r>
+              <w:rPr>
+                <w:rFonts w:ascii="Calibri" w:hAnsi="Calibri"/>
+                <w:b/>
+                <w:color w:val="0D3B66"/>
+                <w:sz w:val="18"/>
+              </w:rPr>
+              <w:t>MAM Maipú</w:t>
+            </w:r>
+          </w:p>
+        </w:tc>
+        <w:tc>
+          <w:tcPr>
+            <w:tcW w:type="dxa" w:w="2550"/>
+            <w:shd w:fill="FFFFFF" w:val="clear"/>
+          </w:tcPr>
+          <w:p>
+            <w:pPr>
+              <w:jc w:val="left"/>
+            </w:pPr>
+            <w:r/>
+            <w:r>
+              <w:rPr>
+                <w:rFonts w:ascii="Calibri" w:hAnsi="Calibri"/>
+                <w:b w:val="0"/>
+                <w:color w:val="0D3B66"/>
+                <w:sz w:val="18"/>
+              </w:rPr>
+              <w:t>Diario · Placa Bancaria (08): 155 m³/día</w:t>
+            </w:r>
+          </w:p>
+        </w:tc>
+        <w:tc>
+          <w:tcPr>
+            <w:tcW w:type="dxa" w:w="2550"/>
+            <w:shd w:fill="FFFFFF" w:val="clear"/>
+          </w:tcPr>
+          <w:p>
+            <w:pPr>
+              <w:jc w:val="left"/>
+            </w:pPr>
+            <w:r/>
+            <w:r>
+              <w:rPr>
+                <w:rFonts w:ascii="Calibri" w:hAnsi="Calibri"/>
+                <w:b w:val="0"/>
+                <w:color w:val="0D3B66"/>
+                <w:sz w:val="18"/>
+              </w:rPr>
+              <w:t>Diario · Ripley (10): 125 m³/día</w:t>
+            </w:r>
+          </w:p>
+        </w:tc>
+        <w:tc>
+          <w:tcPr>
+            <w:tcW w:type="dxa" w:w="2550"/>
+            <w:shd w:fill="FFFFFF" w:val="clear"/>
+          </w:tcPr>
+          <w:p>
+            <w:pPr>
+              <w:jc w:val="left"/>
+            </w:pPr>
+            <w:r/>
+            <w:r>
+              <w:rPr>
+                <w:rFonts w:ascii="Calibri" w:hAnsi="Calibri"/>
+                <w:b w:val="0"/>
+                <w:color w:val="0D3B66"/>
+                <w:sz w:val="18"/>
+              </w:rPr>
+              <w:t>Atrapa otro 18/06 (~410) sin media inflada</w:t>
+            </w:r>
+          </w:p>
+        </w:tc>
+      </w:tr>
+      <w:tr>
+        <w:tc>
+          <w:tcPr>
+            <w:tcW w:type="dxa" w:w="2550"/>
+            <w:shd w:fill="F5F7FA" w:val="clear"/>
+          </w:tcPr>
+          <w:p>
+            <w:pPr>
+              <w:jc w:val="left"/>
+            </w:pPr>
+            <w:r/>
+            <w:r>
+              <w:rPr>
+                <w:rFonts w:ascii="Calibri" w:hAnsi="Calibri"/>
+                <w:b/>
+                <w:color w:val="0D3B66"/>
+                <w:sz w:val="18"/>
+              </w:rPr>
+              <w:t>MAQ Quilicura</w:t>
+            </w:r>
+          </w:p>
+        </w:tc>
+        <w:tc>
+          <w:tcPr>
+            <w:tcW w:type="dxa" w:w="2550"/>
+            <w:shd w:fill="F5F7FA" w:val="clear"/>
+          </w:tcPr>
+          <w:p>
+            <w:pPr>
+              <w:jc w:val="left"/>
+            </w:pPr>
+            <w:r/>
+            <w:r>
+              <w:rPr>
+                <w:rFonts w:ascii="Calibri" w:hAnsi="Calibri"/>
+                <w:b w:val="0"/>
+                <w:color w:val="0D3B66"/>
+                <w:sz w:val="18"/>
+              </w:rPr>
+              <w:t>Nocturno · Matriz Principal (13): &gt; 8 m³ 00–06 h</w:t>
+            </w:r>
+          </w:p>
+        </w:tc>
+        <w:tc>
+          <w:tcPr>
+            <w:tcW w:type="dxa" w:w="2550"/>
+            <w:shd w:fill="F5F7FA" w:val="clear"/>
+          </w:tcPr>
+          <w:p>
+            <w:pPr>
+              <w:jc w:val="left"/>
+            </w:pPr>
+            <w:r/>
+            <w:r>
+              <w:rPr>
+                <w:rFonts w:ascii="Calibri" w:hAnsi="Calibri"/>
+                <w:b w:val="0"/>
+                <w:color w:val="0D3B66"/>
+                <w:sz w:val="18"/>
+              </w:rPr>
+              <w:t>Diario · Matriz Principal (13): 230 m³/día</w:t>
+            </w:r>
+          </w:p>
+        </w:tc>
+        <w:tc>
+          <w:tcPr>
+            <w:tcW w:type="dxa" w:w="2550"/>
+            <w:shd w:fill="F5F7FA" w:val="clear"/>
+          </w:tcPr>
+          <w:p>
+            <w:pPr>
+              <w:jc w:val="left"/>
+            </w:pPr>
+            <w:r/>
+            <w:r>
+              <w:rPr>
+                <w:rFonts w:ascii="Calibri" w:hAnsi="Calibri"/>
+                <w:b w:val="0"/>
+                <w:color w:val="0D3B66"/>
+                <w:sz w:val="18"/>
+              </w:rPr>
+              <w:t>Hoy 21–26 m³; sin on/off</w:t>
+            </w:r>
+          </w:p>
+        </w:tc>
+      </w:tr>
+      <w:tr>
+        <w:tc>
+          <w:tcPr>
+            <w:tcW w:type="dxa" w:w="2550"/>
+            <w:shd w:fill="FFFFFF" w:val="clear"/>
+          </w:tcPr>
+          <w:p>
+            <w:pPr>
+              <w:jc w:val="left"/>
+            </w:pPr>
+            <w:r/>
+            <w:r>
+              <w:rPr>
+                <w:rFonts w:ascii="Calibri" w:hAnsi="Calibri"/>
+                <w:b/>
+                <w:color w:val="0D3B66"/>
+                <w:sz w:val="18"/>
+              </w:rPr>
+              <w:t>BOM Buenaventura</w:t>
+            </w:r>
+          </w:p>
+        </w:tc>
+        <w:tc>
+          <w:tcPr>
+            <w:tcW w:type="dxa" w:w="2550"/>
+            <w:shd w:fill="FFFFFF" w:val="clear"/>
+          </w:tcPr>
+          <w:p>
+            <w:pPr>
+              <w:jc w:val="left"/>
+            </w:pPr>
+            <w:r/>
+            <w:r>
+              <w:rPr>
+                <w:rFonts w:ascii="Calibri" w:hAnsi="Calibri"/>
+                <w:b w:val="0"/>
+                <w:color w:val="0D3B66"/>
+                <w:sz w:val="18"/>
+              </w:rPr>
+              <w:t>Diario · San Ignacio 500 (18): 145 m³/día</w:t>
+            </w:r>
+          </w:p>
+        </w:tc>
+        <w:tc>
+          <w:tcPr>
+            <w:tcW w:type="dxa" w:w="2550"/>
+            <w:shd w:fill="FFFFFF" w:val="clear"/>
+          </w:tcPr>
+          <w:p>
+            <w:pPr>
+              <w:jc w:val="left"/>
+            </w:pPr>
+            <w:r/>
+            <w:r>
+              <w:rPr>
+                <w:rFonts w:ascii="Calibri" w:hAnsi="Calibri"/>
+                <w:b w:val="0"/>
+                <w:color w:val="0D3B66"/>
+                <w:sz w:val="18"/>
+              </w:rPr>
+              <w:t>Nocturno · San Ignacio 300 (17): &gt; 4 m³ 00–06 h</w:t>
+            </w:r>
+          </w:p>
+        </w:tc>
+        <w:tc>
+          <w:tcPr>
+            <w:tcW w:type="dxa" w:w="2550"/>
+            <w:shd w:fill="FFFFFF" w:val="clear"/>
+          </w:tcPr>
+          <w:p>
+            <w:pPr>
+              <w:jc w:val="left"/>
+            </w:pPr>
+            <w:r/>
+            <w:r>
+              <w:rPr>
+                <w:rFonts w:ascii="Calibri" w:hAnsi="Calibri"/>
+                <w:b w:val="0"/>
+                <w:color w:val="0D3B66"/>
+                <w:sz w:val="18"/>
+              </w:rPr>
+              <w:t>Noche ya controlada; vigila el día</w:t>
+            </w:r>
+          </w:p>
+        </w:tc>
+      </w:tr>
+      <w:tr>
+        <w:tc>
+          <w:tcPr>
+            <w:tcW w:type="dxa" w:w="2550"/>
+            <w:shd w:fill="F5F7FA" w:val="clear"/>
+          </w:tcPr>
+          <w:p>
+            <w:pPr>
+              <w:jc w:val="left"/>
+            </w:pPr>
+            <w:r/>
+            <w:r>
+              <w:rPr>
+                <w:rFonts w:ascii="Calibri" w:hAnsi="Calibri"/>
+                <w:b/>
+                <w:color w:val="0D3B66"/>
+                <w:sz w:val="18"/>
+              </w:rPr>
+              <w:t>AEB El Bosque</w:t>
+            </w:r>
+          </w:p>
+        </w:tc>
+        <w:tc>
+          <w:tcPr>
+            <w:tcW w:type="dxa" w:w="2550"/>
+            <w:shd w:fill="F5F7FA" w:val="clear"/>
+          </w:tcPr>
+          <w:p>
+            <w:pPr>
+              <w:jc w:val="left"/>
+            </w:pPr>
+            <w:r/>
+            <w:r>
+              <w:rPr>
+                <w:rFonts w:ascii="Calibri" w:hAnsi="Calibri"/>
+                <w:b w:val="0"/>
+                <w:color w:val="0D3B66"/>
+                <w:sz w:val="18"/>
+              </w:rPr>
+              <w:t>Nocturno · Matriz 1° piso (11): &gt; 3 m³ 00–06 h</w:t>
+            </w:r>
+          </w:p>
+        </w:tc>
+        <w:tc>
+          <w:tcPr>
+            <w:tcW w:type="dxa" w:w="2550"/>
+            <w:shd w:fill="F5F7FA" w:val="clear"/>
+          </w:tcPr>
+          <w:p>
+            <w:pPr>
+              <w:jc w:val="left"/>
+            </w:pPr>
+            <w:r/>
+            <w:r>
+              <w:rPr>
+                <w:rFonts w:ascii="Calibri" w:hAnsi="Calibri"/>
+                <w:b w:val="0"/>
+                <w:color w:val="0D3B66"/>
+                <w:sz w:val="18"/>
+              </w:rPr>
+              <w:t>Diario · Anillo Plaza (12): 22 m³/día</w:t>
+            </w:r>
+          </w:p>
+        </w:tc>
+        <w:tc>
+          <w:tcPr>
+            <w:tcW w:type="dxa" w:w="2550"/>
+            <w:shd w:fill="F5F7FA" w:val="clear"/>
+          </w:tcPr>
+          <w:p>
+            <w:pPr>
+              <w:jc w:val="left"/>
+            </w:pPr>
+            <w:r/>
+            <w:r>
+              <w:rPr>
+                <w:rFonts w:ascii="Calibri" w:hAnsi="Calibri"/>
+                <w:b w:val="0"/>
+                <w:color w:val="0D3B66"/>
+                <w:sz w:val="18"/>
+              </w:rPr>
+              <w:t>10/08 = 6,5 m³; día estable</w:t>
+            </w:r>
+          </w:p>
+        </w:tc>
+      </w:tr>
+      <w:tr>
+        <w:tc>
+          <w:tcPr>
+            <w:tcW w:type="dxa" w:w="2550"/>
+            <w:shd w:fill="FFFFFF" w:val="clear"/>
+          </w:tcPr>
+          <w:p>
+            <w:pPr>
+              <w:jc w:val="left"/>
+            </w:pPr>
+            <w:r/>
+            <w:r>
+              <w:rPr>
+                <w:rFonts w:ascii="Calibri" w:hAnsi="Calibri"/>
+                <w:b/>
+                <w:color w:val="0D3B66"/>
+                <w:sz w:val="18"/>
+              </w:rPr>
+              <w:t>CUR Curauma</w:t>
+            </w:r>
+          </w:p>
+        </w:tc>
+        <w:tc>
+          <w:tcPr>
+            <w:tcW w:type="dxa" w:w="2550"/>
+            <w:shd w:fill="FFFFFF" w:val="clear"/>
+          </w:tcPr>
+          <w:p>
+            <w:pPr>
+              <w:jc w:val="left"/>
+            </w:pPr>
+            <w:r/>
+            <w:r>
+              <w:rPr>
+                <w:rFonts w:ascii="Calibri" w:hAnsi="Calibri"/>
+                <w:b w:val="0"/>
+                <w:color w:val="0D3B66"/>
+                <w:sz w:val="18"/>
+              </w:rPr>
+              <w:t>Diario · Anillo Sur (37): 14 m³/día</w:t>
+            </w:r>
+          </w:p>
+        </w:tc>
+        <w:tc>
+          <w:tcPr>
+            <w:tcW w:type="dxa" w:w="2550"/>
+            <w:shd w:fill="FFFFFF" w:val="clear"/>
+          </w:tcPr>
+          <w:p>
+            <w:pPr>
+              <w:jc w:val="left"/>
+            </w:pPr>
+            <w:r/>
+            <w:r>
+              <w:rPr>
+                <w:rFonts w:ascii="Calibri" w:hAnsi="Calibri"/>
+                <w:b w:val="0"/>
+                <w:color w:val="0D3B66"/>
+                <w:sz w:val="18"/>
+              </w:rPr>
+              <w:t>Diario · Anillo Norte (38): 13 m³/día</w:t>
+            </w:r>
+          </w:p>
+        </w:tc>
+        <w:tc>
+          <w:tcPr>
+            <w:tcW w:type="dxa" w:w="2550"/>
+            <w:shd w:fill="FFFFFF" w:val="clear"/>
+          </w:tcPr>
+          <w:p>
+            <w:pPr>
+              <w:jc w:val="left"/>
+            </w:pPr>
+            <w:r/>
+            <w:r>
+              <w:rPr>
+                <w:rFonts w:ascii="Calibri" w:hAnsi="Calibri"/>
+                <w:b w:val="0"/>
+                <w:color w:val="0D3B66"/>
+                <w:sz w:val="18"/>
+              </w:rPr>
+              <w:t>Recinto estable; mayor volumen</w:t>
+            </w:r>
+          </w:p>
+        </w:tc>
+      </w:tr>
+      <w:tr>
+        <w:tc>
+          <w:tcPr>
+            <w:tcW w:type="dxa" w:w="2550"/>
+            <w:shd w:fill="F5F7FA" w:val="clear"/>
+          </w:tcPr>
+          <w:p>
+            <w:pPr>
+              <w:jc w:val="left"/>
+            </w:pPr>
+            <w:r/>
+            <w:r>
+              <w:rPr>
+                <w:rFonts w:ascii="Calibri" w:hAnsi="Calibri"/>
+                <w:b/>
+                <w:color w:val="0D3B66"/>
+                <w:sz w:val="18"/>
+              </w:rPr>
+              <w:t>PAK Kennedy</w:t>
+            </w:r>
+          </w:p>
+        </w:tc>
+        <w:tc>
+          <w:tcPr>
+            <w:tcW w:type="dxa" w:w="2550"/>
+            <w:shd w:fill="F5F7FA" w:val="clear"/>
+          </w:tcPr>
+          <w:p>
+            <w:pPr>
+              <w:jc w:val="left"/>
+            </w:pPr>
+            <w:r/>
+            <w:r>
+              <w:rPr>
+                <w:rFonts w:ascii="Calibri" w:hAnsi="Calibri"/>
+                <w:b w:val="0"/>
+                <w:color w:val="0D3B66"/>
+                <w:sz w:val="18"/>
+              </w:rPr>
+              <w:t>Nocturno · Distrito de Lujo (27): &gt; 15 m³ 00–06 h</w:t>
+            </w:r>
+          </w:p>
+        </w:tc>
+        <w:tc>
+          <w:tcPr>
+            <w:tcW w:type="dxa" w:w="2550"/>
+            <w:shd w:fill="F5F7FA" w:val="clear"/>
+          </w:tcPr>
+          <w:p>
+            <w:pPr>
+              <w:jc w:val="left"/>
+            </w:pPr>
+            <w:r/>
+            <w:r>
+              <w:rPr>
+                <w:rFonts w:ascii="Calibri" w:hAnsi="Calibri"/>
+                <w:b w:val="0"/>
+                <w:color w:val="0D3B66"/>
+                <w:sz w:val="18"/>
+              </w:rPr>
+              <w:t>Diario · Andén Locales Gastro (21): 180 m³/día</w:t>
+            </w:r>
+          </w:p>
+        </w:tc>
+        <w:tc>
+          <w:tcPr>
+            <w:tcW w:type="dxa" w:w="2550"/>
+            <w:shd w:fill="F5F7FA" w:val="clear"/>
+          </w:tcPr>
+          <w:p>
+            <w:pPr>
+              <w:jc w:val="left"/>
+            </w:pPr>
+            <w:r/>
+            <w:r>
+              <w:rPr>
+                <w:rFonts w:ascii="Calibri" w:hAnsi="Calibri"/>
+                <w:b w:val="0"/>
+                <w:color w:val="0D3B66"/>
+                <w:sz w:val="18"/>
+              </w:rPr>
+              <w:t>10/08 = 41 m³; mayor impacto</w:t>
+            </w:r>
+          </w:p>
+        </w:tc>
+      </w:tr>
+    </w:tbl>
     <w:sectPr>
       <w:pgSz w:w="12240" w:h="15840"/>
       <w:pgMar w:top="907" w:right="1020" w:bottom="907" w:left="1020" w:header="720" w:footer="720" w:gutter="0"/>

</xml_diff>